<commit_message>
fix(contratos): actualiza contrato de cartera con versión final de jurídico + placeholders
Reemplaza el template por la versión de jurídico (elimina la subcláusula
"Plan de Pagos Proyectado" y renumera Reinversión de e) a d)) y re-inyecta
los placeholders docxtemplater: {nombreCompleto}, {dpiTexto}, {diaTexto},
{mesTexto}, {anoTexto}. Restaura el bloque de firma (EL INVERSIONISTA / Nombre y DPI).

Co-Authored-By: Claude Opus 4.8 <noreply@anthropic.com>
</commit_message>
<xml_diff>
--- a/apps/legal-docs-blueprints/templates/inversiones/contrato_participacion_administracion_cartera/contrato_participacion_administracion_cartera.docx
+++ b/apps/legal-docs-blueprints/templates/inversiones/contrato_participacion_administracion_cartera/contrato_participacion_administracion_cartera.docx
@@ -277,7 +277,7 @@
       <w:sdt>
         <w:sdtPr>
           <w:tag w:val="goog_rdk_0"/>
-          <w:id w:val="-1251092272"/>
+          <w:id w:val="728407716"/>
         </w:sdtPr>
         <w:sdtContent>
           <w:r>
@@ -305,14 +305,10 @@
         <w:rPr/>
         <w:t xml:space="preserve">, identificado/a con Documento Personal de Identificación, Código Único de Identificación </w:t>
       </w:r>
-      <w:r>
-        <w:rPr/>
-        <w:t>{dpiTexto}</w:t>
-      </w:r>
       <w:sdt>
         <w:sdtPr>
           <w:tag w:val="goog_rdk_1"/>
-          <w:id w:val="231650263"/>
+          <w:id w:val="-1248005647"/>
         </w:sdtPr>
         <w:sdtContent>
           <w:r>
@@ -323,6 +319,10 @@
           </w:r>
         </w:sdtContent>
       </w:sdt>
+      <w:r>
+        <w:rPr/>
+        <w:t>{dpiTexto}</w:t>
+      </w:r>
       <w:r>
         <w:rPr/>
         <w:t xml:space="preserve">, extendido por el Registro Nacional de las Personas —RENAP—, quien actúa en nombre propio (en adelante </w:t>
@@ -1915,53 +1915,6 @@
           <w:color w:val="5B4FCF"/>
         </w:rPr>
         <w:t xml:space="preserve">d)  </w:t>
-      </w:r>
-      <w:r>
-        <w:rPr>
-          <w:b/>
-          <w:bCs/>
-        </w:rPr>
-        <w:t>Plan de pagos proyectado</w:t>
-      </w:r>
-    </w:p>
-    <w:p>
-      <w:pPr>
-        <w:pStyle w:val="normal1"/>
-        <w:spacing w:lineRule="auto" w:line="360"/>
-        <w:jc w:val="both"/>
-        <w:rPr/>
-      </w:pPr>
-      <w:r>
-        <w:rPr/>
-        <w:t>Para fines informativos, Cube entregará al Inversionista un Anexo 2 — Plan de Pagos Proyectado, con la estimación de flujos de capital e intereses derivados de su inversión. Dicho plan es una proyección referencial basada en supuestos de pago puntual y no tiene carácter vinculante ni constituye obligación de pago a cargo de Cube.</w:t>
-      </w:r>
-    </w:p>
-    <w:p>
-      <w:pPr>
-        <w:pStyle w:val="normal1"/>
-        <w:spacing w:lineRule="auto" w:line="360"/>
-        <w:jc w:val="both"/>
-        <w:rPr/>
-      </w:pPr>
-      <w:r>
-        <w:rPr/>
-      </w:r>
-    </w:p>
-    <w:p>
-      <w:pPr>
-        <w:pStyle w:val="normal1"/>
-        <w:spacing w:lineRule="auto" w:line="360"/>
-        <w:ind w:hanging="0" w:start="200"/>
-        <w:jc w:val="both"/>
-        <w:rPr/>
-      </w:pPr>
-      <w:r>
-        <w:rPr>
-          <w:b/>
-          <w:bCs/>
-          <w:color w:val="5B4FCF"/>
-        </w:rPr>
-        <w:t xml:space="preserve">e)  </w:t>
       </w:r>
       <w:r>
         <w:rPr>
@@ -3675,7 +3628,7 @@
       <w:sdt>
         <w:sdtPr>
           <w:tag w:val="goog_rdk_2"/>
-          <w:id w:val="452141389"/>
+          <w:id w:val="1142949382"/>
         </w:sdtPr>
         <w:sdtContent>
           <w:r>
@@ -3688,49 +3641,7 @@
       </w:sdt>
       <w:r>
         <w:rPr/>
-        <w:t>{diaTexto}</w:t>
-      </w:r>
-      <w:r>
-        <w:rPr/>
-        <w:t xml:space="preserve"> de </w:t>
-      </w:r>
-      <w:r>
-        <w:rPr/>
-        <w:t>{mesTexto}</w:t>
-      </w:r>
-      <w:r>
-        <w:rPr/>
-        <w:t xml:space="preserve"> de dos mil </w:t>
-      </w:r>
-      <w:r>
-        <w:rPr/>
-        <w:t>{anoTexto}</w:t>
-      </w:r>
-      <w:r>
-        <w:rPr/>
-        <w:t>.</w:t>
-      </w:r>
-    </w:p>
-    <w:p>
-      <w:pPr>
-        <w:pStyle w:val="normal1"/>
-        <w:spacing w:lineRule="auto" w:line="360"/>
-        <w:jc w:val="both"/>
-        <w:rPr/>
-      </w:pPr>
-      <w:r>
-        <w:rPr/>
-      </w:r>
-    </w:p>
-    <w:p>
-      <w:pPr>
-        <w:pStyle w:val="normal1"/>
-        <w:spacing w:lineRule="auto" w:line="360"/>
-        <w:jc w:val="both"/>
-        <w:rPr/>
-      </w:pPr>
-      <w:r>
-        <w:rPr/>
+        <w:t>{diaTexto} de {mesTexto} de dos mil {anoTexto}.</w:t>
       </w:r>
     </w:p>
     <w:p>
@@ -3798,9 +3709,7 @@
         <w:gridCol w:w="4501"/>
       </w:tblGrid>
       <w:tr>
-        <w:trPr>
-          <w:trHeight w:val="1350" w:hRule="atLeast"/>
-        </w:trPr>
+        <w:trPr/>
         <w:tc>
           <w:tcPr>
             <w:tcW w:w="4500" w:type="dxa"/>
@@ -3913,7 +3822,7 @@
             <w:sdt>
               <w:sdtPr>
                 <w:tag w:val="goog_rdk_3"/>
-                <w:id w:val="287913165"/>
+                <w:id w:val="1123527439"/>
               </w:sdtPr>
               <w:sdtContent>
                 <w:r>
@@ -3930,6 +3839,20 @@
                 <w:bCs/>
                 <w:color w:val="5B4FCF"/>
               </w:rPr>
+              <w:t>EL INVERSIONISTA</w:t>
+            </w:r>
+          </w:p>
+          <w:p>
+            <w:pPr>
+              <w:pStyle w:val="normal1"/>
+              <w:spacing w:lineRule="auto" w:line="360"/>
+              <w:jc w:val="both"/>
+              <w:rPr/>
+            </w:pPr>
+            <w:r>
+              <w:rPr>
+                <w:color w:val="8888AA"/>
+              </w:rPr>
               <w:t>{nombreCompleto}</w:t>
             </w:r>
           </w:p>
@@ -3938,12 +3861,13 @@
               <w:pStyle w:val="normal1"/>
               <w:spacing w:lineRule="auto" w:line="360"/>
               <w:jc w:val="both"/>
+              <w:rPr/>
+            </w:pPr>
+            <w:r>
               <w:rPr>
                 <w:color w:val="8888AA"/>
               </w:rPr>
-            </w:pPr>
-            <w:r>
-              <w:rPr/>
+              <w:t>Nombre y DPI</w:t>
             </w:r>
           </w:p>
         </w:tc>
@@ -4026,7 +3950,7 @@
     </w:r>
     <w:r>
       <w:rPr/>
-      <w:t>7</w:t>
+      <w:t>8</w:t>
     </w:r>
     <w:r>
       <w:rPr/>
@@ -4097,7 +4021,7 @@
     </w:r>
     <w:r>
       <w:rPr/>
-      <w:t>7</w:t>
+      <w:t>8</w:t>
     </w:r>
     <w:r>
       <w:rPr/>
@@ -4982,6 +4906,29 @@
     <w:pPr/>
     <w:rPr/>
   </w:style>
+  <w:style w:type="paragraph" w:styleId="Contenidodelatabla">
+    <w:name w:val="Contenido de la tabla"/>
+    <w:basedOn w:val="Normal"/>
+    <w:qFormat/>
+    <w:pPr>
+      <w:widowControl w:val="false"/>
+      <w:suppressLineNumbers/>
+    </w:pPr>
+    <w:rPr/>
+  </w:style>
+  <w:style w:type="paragraph" w:styleId="Ttulodelatabla">
+    <w:name w:val="Título de la tabla"/>
+    <w:basedOn w:val="Contenidodelatabla"/>
+    <w:qFormat/>
+    <w:pPr>
+      <w:suppressLineNumbers/>
+      <w:jc w:val="center"/>
+    </w:pPr>
+    <w:rPr>
+      <w:b/>
+      <w:bCs/>
+    </w:rPr>
+  </w:style>
   <w:style w:type="table" w:default="1" w:styleId="TableNormal">
     <w:name w:val="TableNormal"/>
     <w:tblPr>
@@ -5170,7 +5117,7 @@
 
 <file path=customXml/item1.xml><?xml version="1.0" encoding="utf-8"?>
 <go:gDocsCustomXmlDataStorage xmlns:go="http://customooxmlschemas.google.com/" xmlns:r="http://schemas.openxmlformats.org/officeDocument/2006/relationships" uri="GoogleDocsCustomDataVersion2">
-  <go:docsCustomData roundtripDataSignature="AMtx7mjrlNnKbNB9OeviAXy5I9L+4e7FBQ==">CgMxLjAaJwoBMBIiCiAIBCocCgtBQUFDQUFkWHZudxAIGgtBQUFDQUFkWHZudxonCgExEiIKIAgEKhwKC0FBQUNBQWRYdm4wEAgaC0FBQUNBQWRYdm4wGicKATISIgogCAQqHAoLQUFBQ0FBZFh2bjQQCBoLQUFBQ0FBZFh2bjQaJwoBMxIiCiAIBCocCgtBQUFDQUFkWHZvURAIGgtBQUFDQUFkWHZvUSLqAgoLQUFBQ0FBZFh2b1ESuwIKC0FBQUNBQWRYdm9REgtBQUFDQUFkWHZvURo/Cgl0ZXh0L2h0bWwSMk5PTUJSRSBERUwgSU5WRVJTSU9OSVNUQSBFTiBORUdSSUxMQSBZIE1BWcOaU0NVTEFTIkAKCnRleHQvcGxhaW4SMk5PTUJSRSBERUwgSU5WRVJTSU9OSVNUQSBFTiBORUdSSUxMQSBZIE1BWcOaU0NVTEFTKhsiFTEwMTE3NjIwODgwNTcxMjE3MjAwNigAOAAw+9WB2/YzOMKdgtv2M0oeCgp0ZXh0L3BsYWluEhBFTCBJTlZFUlNJT05JU1RBWgt3c29rZHhzdDJwMHICIAB4AJoBBggAEAAYAKoBNBIyTk9NQlJFIERFTCBJTlZFUlNJT05JU1RBIEVOIE5FR1JJTExBIFkgTUFZw5pTQ1VMQVMY+9WB2/YzIMKdgtv2M0IPa2l4LjVzOGhneDFzdGY4Io0DCgtBQUFDQUFkWHZuMBLdAgoLQUFBQ0FBZFh2bjASC0FBQUNBQWRYdm4wGkUKCXRleHQvaHRtbBI4TsOaTUVSTyBERSBEUEkgRU4gTEVUUkFTIFkgRU5UUkUgUEFSw4lOVEVTSVMgRU4gTsOaTUVST1MiRgoKdGV4dC9wbGFpbhI4TsOaTUVSTyBERSBEUEkgRU4gTEVUUkFTIFkgRU5UUkUgUEFSw4lOVEVTSVMgRU4gTsOaTUVST1MqGyIVMTAxMTc2MjA4ODA1NzEyMTcyMDA2KAA4ADCdhNba9jM4nYTW2vYzSi0KCnRleHQvcGxhaW4SH19fX19fX19fX19fX19fX19fX19fX19fX19fX19fX19aDDVidzJqY2UwM3R6cXICIAB4AJoBBggAEAAYAKoBOhI4TsOaTUVSTyBERSBEUEkgRU4gTEVUUkFTIFkgRU5UUkUgUEFSw4lOVEVTSVMgRU4gTsOaTUVST1MYnYTW2vYzIJ2E1tr2M0IQa2l4LnFxMG12ZGhicXFzbyKsAwoLQUFBQ0FBZFh2bjQS/AIKC0FBQUNBQWRYdm40EgtBQUFDQUFkWHZuNBpHCgl0ZXh0L2h0bWwSOkZFQ0hBIEVOIExBIFFVRSBTRSBGSVJNQSBFTCBDT05UUkFUTyBFTiBMRVRSQVMgTUlOw5pTQ1VMQVMiSAoKdGV4dC9wbGFpbhI6RkVDSEEgRU4gTEEgUVVFIFNFIEZJUk1BIEVMIENPTlRSQVRPIEVOIExFVFJBUyBNSU7DmlNDVUxBUyobIhUxMDExNzYyMDg4MDU3MTIxNzIwMDYoADgAMKz319r2Mzis99fa9jNKRgoKdGV4dC9wbGFpbhI4X19fX19fX19fX19fXyBkZSBfX19fX19fX19fX19fIGRlIGRvcyBtaWwgX19fX19fX19fX19fXy5aDHo3b3Z4ZHZzd2lqdHICIAB4AJoBBggAEAAYAKoBPBI6RkVDSEEgRU4gTEEgUVVFIFNFIEZJUk1BIEVMIENPTlRSQVRPIEVOIExFVFJBUyBNSU7DmlNDVUxBUxis99fa9jMgrPfX2vYzQhBraXguamFuaGR6eXlmdmd1Ip8DCgtBQUFDQUFkWHZudxLvAgoLQUFBQ0FBZFh2bncSC0FBQUNBQWRYdm53GkYKCXRleHQvaHRtbBI5Tk9NQlJFIERFTCBJTlZFUlNJT05JU1RBIEVOIExFVFJBUyBNQVnDmlNDVUxBUyBZIE5FR1JJTExBIkcKCnRleHQvcGxhaW4SOU5PTUJSRSBERUwgSU5WRVJTSU9OSVNUQSBFTiBMRVRSQVMgTUFZw5pTQ1VMQVMgWSBORUdSSUxMQSobIhUxMDExNzYyMDg4MDU3MTIxNzIwMDYoADgAMJG61Nr2MziRutTa9jNKPQoKdGV4dC9wbGFpbhIvX19fX19fX19fX19fX19fX19fX19fX19fX19fX19fX19fX19fX19fX19fX19fX19aC2M2Ynh3cWFvd2FkcgIgAHgAmgEGCAAQABgAqgE7EjlOT01CUkUgREVMIElOVkVSU0lPTklTVEEgRU4gTEVUUkFTIE1BWcOaU0NVTEFTIFkgTkVHUklMTEEYkbrU2vYzIJG61Nr2M0IQa2l4LjMwaWN1c3ZkazltNTgAciExaEx5SHd2OEE5cVY5U24zTU4xOHgwektmdExPTXh6MlI=</go:docsCustomData>
+  <go:docsCustomData roundtripDataSignature="AMtx7mihj4yExvgkqK2UtcDrMoKV1oWtlw==">CgMxLjAaJwoBMBIiCiAIBCocCgtBQUFDQUFkWHZudxAIGgtBQUFDQUFkWHZudxonCgExEiIKIAgEKhwKC0FBQUNBQWRYdm4wEAgaC0FBQUNBQWRYdm4wGicKATISIgogCAQqHAoLQUFBQ0FBZFh2bjQQCBoLQUFBQ0FBZFh2bjQaJwoBMxIiCiAIBCocCgtBQUFDQUFkWHZvURAIGgtBQUFDQUFkWHZvUSL1AgoLQUFBQ0FBZFh2b1ESxAIKC0FBQUNBQWRYdm9REgtBQUFDQUFkWHZvURo/Cgl0ZXh0L2h0bWwSMk5PTUJSRSBERUwgSU5WRVJTSU9OSVNUQSBFTiBORUdSSUxMQSBZIE1BWcOaU0NVTEFTIkAKCnRleHQvcGxhaW4SMk5PTUJSRSBERUwgSU5WRVJTSU9OSVNUQSBFTiBORUdSSUxMQSBZIE1BWcOaU0NVTEFTKhsiFTEwMTE3NjIwODgwNTcxMjE3MjAwNigAOAAw+9WB2/YzOMKdgtv2M0oeCgp0ZXh0L3BsYWluEhBFTCBJTlZFUlNJT05JU1RBWgt3c29rZHhzdDJwMHICIAB4AJoBBggAEAAYAKoBNBIyTk9NQlJFIERFTCBJTlZFUlNJT05JU1RBIEVOIE5FR1JJTExBIFkgTUFZw5pTQ1VMQVOwAQC4AQDIAQAY+9WB2/YzIMKdgtv2MzAAQg9raXguNXM4aGd4MXN0ZjgimAMKC0FBQUNBQWRYdm4wEuYCCgtBQUFDQUFkWHZuMBILQUFBQ0FBZFh2bjAaRQoJdGV4dC9odG1sEjhOw5pNRVJPIERFIERQSSBFTiBMRVRSQVMgWSBFTlRSRSBQQVLDiU5URVNJUyBFTiBOw5pNRVJPUyJGCgp0ZXh0L3BsYWluEjhOw5pNRVJPIERFIERQSSBFTiBMRVRSQVMgWSBFTlRSRSBQQVLDiU5URVNJUyBFTiBOw5pNRVJPUyobIhUxMDExNzYyMDg4MDU3MTIxNzIwMDYoADgAMJ2E1tr2MzidhNba9jNKLQoKdGV4dC9wbGFpbhIfX19fX19fX19fX19fX19fX19fX19fX19fX19fX19fX1oMNWJ3MmpjZTAzdHpxcgIgAHgAmgEGCAAQABgAqgE6EjhOw5pNRVJPIERFIERQSSBFTiBMRVRSQVMgWSBFTlRSRSBQQVLDiU5URVNJUyBFTiBOw5pNRVJPU7ABALgBAMgBABidhNba9jMgnYTW2vYzMABCEGtpeC5xcTBtdmRoYnFxc28itwMKC0FBQUNBQWRYdm40EoUDCgtBQUFDQUFkWHZuNBILQUFBQ0FBZFh2bjQaRwoJdGV4dC9odG1sEjpGRUNIQSBFTiBMQSBRVUUgU0UgRklSTUEgRUwgQ09OVFJBVE8gRU4gTEVUUkFTIE1JTsOaU0NVTEFTIkgKCnRleHQvcGxhaW4SOkZFQ0hBIEVOIExBIFFVRSBTRSBGSVJNQSBFTCBDT05UUkFUTyBFTiBMRVRSQVMgTUlOw5pTQ1VMQVMqGyIVMTAxMTc2MjA4ODA1NzEyMTcyMDA2KAA4ADCs99fa9jM4rPfX2vYzSkYKCnRleHQvcGxhaW4SOF9fX19fX19fX19fX18gZGUgX19fX19fX19fX19fXyBkZSBkb3MgbWlsIF9fX19fX19fX19fX18uWgx6N292eGR2c3dpanRyAiAAeACaAQYIABAAGACqATwSOkZFQ0hBIEVOIExBIFFVRSBTRSBGSVJNQSBFTCBDT05UUkFUTyBFTiBMRVRSQVMgTUlOw5pTQ1VMQVOwAQC4AQDIAQAYrPfX2vYzIKz319r2MzAAQhBraXguamFuaGR6eXlmdmd1IqoDCgtBQUFDQUFkWHZudxL4AgoLQUFBQ0FBZFh2bncSC0FBQUNBQWRYdm53GkYKCXRleHQvaHRtbBI5Tk9NQlJFIERFTCBJTlZFUlNJT05JU1RBIEVOIExFVFJBUyBNQVnDmlNDVUxBUyBZIE5FR1JJTExBIkcKCnRleHQvcGxhaW4SOU5PTUJSRSBERUwgSU5WRVJTSU9OSVNUQSBFTiBMRVRSQVMgTUFZw5pTQ1VMQVMgWSBORUdSSUxMQSobIhUxMDExNzYyMDg4MDU3MTIxNzIwMDYoADgAMJG61Nr2MziRutTa9jNKPQoKdGV4dC9wbGFpbhIvX19fX19fX19fX19fX19fX19fX19fX19fX19fX19fX19fX19fX19fX19fX19fX19aC2M2Ynh3cWFvd2FkcgIgAHgAmgEGCAAQABgAqgE7EjlOT01CUkUgREVMIElOVkVSU0lPTklTVEEgRU4gTEVUUkFTIE1BWcOaU0NVTEFTIFkgTkVHUklMTEGwAQC4AQDIAQAYkbrU2vYzIJG61Nr2MzAAQhBraXguMzBpY3VzdmRrOW01OAByITFoTHlId3Y4QTlxVjlTbjNNTjE4eDB6S2Z0TE9NeHoyUg==</go:docsCustomData>
 </go:gDocsCustomXmlDataStorage>
 </file>
 

</xml_diff>

<commit_message>
fix(contratos): agrega campos de tasa de retorno al contrato de cartera
Añade los placeholders {tasaRetornoAnual} y {tasaRetornoAnualIva} al template
del Contrato de Participación y Administración de Cartera (inversor individual),
solicitados por jurídico. Incluye también {dpi} en el bloque de firma.

El alta de datos correspondiente (crear los campos en docuseal.field y
enlazarlos a los documentos 9045/9046 en docuseal.detail_document_field) va
por SQL directo en la DB, no en este PR.

Co-Authored-By: Claude Opus 4.8 <noreply@anthropic.com>
</commit_message>
<xml_diff>
--- a/apps/legal-docs-blueprints/templates/inversiones/contrato_participacion_administracion_cartera/contrato_participacion_administracion_cartera.docx
+++ b/apps/legal-docs-blueprints/templates/inversiones/contrato_participacion_administracion_cartera/contrato_participacion_administracion_cartera.docx
@@ -50,17 +50,10 @@
         </w:rPr>
       </w:pPr>
       <w:r>
-        <w:rPr>
-          <w:b/>
-          <w:bCs/>
-          <w:color w:val="5B4FCF"/>
-          <w:sz w:val="24"/>
-          <w:szCs w:val="24"/>
-        </w:rPr>
         <mc:AlternateContent>
           <mc:Choice Requires="wps">
             <w:drawing>
-              <wp:anchor distT="0" distB="0" distL="0" distR="0" simplePos="0" relativeHeight="10" behindDoc="0" locked="0" layoutInCell="1" allowOverlap="1">
+              <wp:anchor distT="9525" distB="10160" distL="635" distR="1270" simplePos="0" relativeHeight="10" behindDoc="0" locked="0" layoutInCell="1" allowOverlap="1">
                 <wp:simplePos x="0" y="0"/>
                 <wp:positionH relativeFrom="column">
                   <wp:posOffset>-26035</wp:posOffset>
@@ -453,7 +446,6 @@
           <w:ilvl w:val="0"/>
           <w:numId w:val="1"/>
         </w:numPr>
-        <w:pBdr/>
         <w:shd w:val="clear" w:fill="auto"/>
         <w:spacing w:lineRule="auto" w:line="360" w:before="0" w:after="0"/>
         <w:ind w:hanging="240" w:start="480" w:end="0"/>
@@ -493,7 +485,6 @@
           <w:ilvl w:val="0"/>
           <w:numId w:val="1"/>
         </w:numPr>
-        <w:pBdr/>
         <w:shd w:val="clear" w:fill="auto"/>
         <w:spacing w:lineRule="auto" w:line="360" w:before="0" w:after="0"/>
         <w:ind w:hanging="240" w:start="480" w:end="0"/>
@@ -533,7 +524,6 @@
           <w:ilvl w:val="0"/>
           <w:numId w:val="1"/>
         </w:numPr>
-        <w:pBdr/>
         <w:shd w:val="clear" w:fill="auto"/>
         <w:spacing w:lineRule="auto" w:line="360" w:before="0" w:after="0"/>
         <w:ind w:hanging="240" w:start="480" w:end="0"/>
@@ -573,7 +563,6 @@
           <w:ilvl w:val="0"/>
           <w:numId w:val="1"/>
         </w:numPr>
-        <w:pBdr/>
         <w:shd w:val="clear" w:fill="auto"/>
         <w:spacing w:lineRule="auto" w:line="360" w:before="0" w:after="0"/>
         <w:ind w:hanging="240" w:start="480" w:end="0"/>
@@ -1570,7 +1559,6 @@
           <w:ilvl w:val="0"/>
           <w:numId w:val="1"/>
         </w:numPr>
-        <w:pBdr/>
         <w:shd w:val="clear" w:fill="auto"/>
         <w:spacing w:lineRule="auto" w:line="360" w:before="0" w:after="0"/>
         <w:ind w:hanging="240" w:start="480" w:end="0"/>
@@ -1610,7 +1598,6 @@
           <w:ilvl w:val="0"/>
           <w:numId w:val="1"/>
         </w:numPr>
-        <w:pBdr/>
         <w:shd w:val="clear" w:fill="auto"/>
         <w:spacing w:lineRule="auto" w:line="360" w:before="0" w:after="0"/>
         <w:ind w:hanging="240" w:start="480" w:end="0"/>
@@ -1650,7 +1637,6 @@
           <w:ilvl w:val="0"/>
           <w:numId w:val="1"/>
         </w:numPr>
-        <w:pBdr/>
         <w:shd w:val="clear" w:fill="auto"/>
         <w:spacing w:lineRule="auto" w:line="360" w:before="0" w:after="0"/>
         <w:ind w:hanging="240" w:start="480" w:end="0"/>
@@ -1690,7 +1676,6 @@
           <w:ilvl w:val="0"/>
           <w:numId w:val="1"/>
         </w:numPr>
-        <w:pBdr/>
         <w:shd w:val="clear" w:fill="auto"/>
         <w:spacing w:lineRule="auto" w:line="360" w:before="0" w:after="0"/>
         <w:ind w:hanging="240" w:start="480" w:end="0"/>
@@ -1730,7 +1715,6 @@
           <w:ilvl w:val="0"/>
           <w:numId w:val="1"/>
         </w:numPr>
-        <w:pBdr/>
         <w:shd w:val="clear" w:fill="auto"/>
         <w:spacing w:lineRule="auto" w:line="360" w:before="0" w:after="0"/>
         <w:ind w:hanging="240" w:start="480" w:end="0"/>
@@ -2108,7 +2092,23 @@
       </w:pPr>
       <w:r>
         <w:rPr/>
-        <w:t>Las partes acuerdan que el Inversionista recibirá una tasa de retorno del _____% anual más IVA (equivalente a una tasa neta de _____% anual) sobre el capital efectivamente colocado</w:t>
+        <w:t xml:space="preserve">Las partes acuerdan que el Inversionista recibirá una tasa de retorno del </w:t>
+      </w:r>
+      <w:r>
+        <w:rPr/>
+        <w:t>{tasaRetornoAnualIva}</w:t>
+      </w:r>
+      <w:r>
+        <w:rPr/>
+        <w:t xml:space="preserve">% anual más IVA (equivalente a una tasa neta de </w:t>
+      </w:r>
+      <w:r>
+        <w:rPr/>
+        <w:t>{tasaRetornoAnual}</w:t>
+      </w:r>
+      <w:r>
+        <w:rPr/>
+        <w:t>% anual) sobre el capital efectivamente colocado</w:t>
       </w:r>
     </w:p>
     <w:p>
@@ -3705,8 +3705,8 @@
       </w:tblPr>
       <w:tblGrid>
         <w:gridCol w:w="4500"/>
-        <w:gridCol w:w="719"/>
-        <w:gridCol w:w="4501"/>
+        <w:gridCol w:w="718"/>
+        <w:gridCol w:w="4502"/>
       </w:tblGrid>
       <w:tr>
         <w:trPr/>
@@ -3777,7 +3777,7 @@
         </w:tc>
         <w:tc>
           <w:tcPr>
-            <w:tcW w:w="719" w:type="dxa"/>
+            <w:tcW w:w="718" w:type="dxa"/>
             <w:tcBorders/>
           </w:tcPr>
           <w:p>
@@ -3794,7 +3794,7 @@
         </w:tc>
         <w:tc>
           <w:tcPr>
-            <w:tcW w:w="4501" w:type="dxa"/>
+            <w:tcW w:w="4502" w:type="dxa"/>
             <w:tcBorders/>
           </w:tcPr>
           <w:p>
@@ -3867,7 +3867,7 @@
               <w:rPr>
                 <w:color w:val="8888AA"/>
               </w:rPr>
-              <w:t>Nombre y DPI</w:t>
+              <w:t>{dpi}</w:t>
             </w:r>
           </w:p>
         </w:tc>
@@ -4533,6 +4533,7 @@
     <w:qFormat/>
     <w:pPr>
       <w:widowControl/>
+      <w:suppressAutoHyphens w:val="true"/>
       <w:bidi w:val="0"/>
       <w:spacing w:before="0" w:after="0"/>
       <w:jc w:val="start"/>
@@ -4556,7 +4557,6 @@
       <w:keepLines w:val="false"/>
       <w:pageBreakBefore w:val="false"/>
       <w:widowControl/>
-      <w:pBdr/>
       <w:shd w:val="clear" w:fill="auto"/>
       <w:spacing w:lineRule="auto" w:line="240" w:before="0" w:after="0"/>
       <w:ind w:hanging="0" w:start="0" w:end="0"/>
@@ -4591,7 +4591,6 @@
       <w:keepLines w:val="false"/>
       <w:pageBreakBefore w:val="false"/>
       <w:widowControl/>
-      <w:pBdr/>
       <w:shd w:val="clear" w:fill="auto"/>
       <w:spacing w:lineRule="auto" w:line="240" w:before="0" w:after="0"/>
       <w:ind w:hanging="0" w:start="0" w:end="0"/>
@@ -4626,7 +4625,6 @@
       <w:keepLines w:val="false"/>
       <w:pageBreakBefore w:val="false"/>
       <w:widowControl/>
-      <w:pBdr/>
       <w:shd w:val="clear" w:fill="auto"/>
       <w:spacing w:lineRule="auto" w:line="240" w:before="0" w:after="0"/>
       <w:ind w:hanging="0" w:start="0" w:end="0"/>
@@ -4661,7 +4659,6 @@
       <w:keepLines w:val="false"/>
       <w:pageBreakBefore w:val="false"/>
       <w:widowControl/>
-      <w:pBdr/>
       <w:shd w:val="clear" w:fill="auto"/>
       <w:spacing w:lineRule="auto" w:line="240" w:before="0" w:after="0"/>
       <w:ind w:hanging="0" w:start="0" w:end="0"/>
@@ -4696,7 +4693,6 @@
       <w:keepLines w:val="false"/>
       <w:pageBreakBefore w:val="false"/>
       <w:widowControl/>
-      <w:pBdr/>
       <w:shd w:val="clear" w:fill="auto"/>
       <w:spacing w:lineRule="auto" w:line="240" w:before="0" w:after="0"/>
       <w:ind w:hanging="0" w:start="0" w:end="0"/>
@@ -4731,7 +4727,6 @@
       <w:keepLines w:val="false"/>
       <w:pageBreakBefore w:val="false"/>
       <w:widowControl/>
-      <w:pBdr/>
       <w:shd w:val="clear" w:fill="auto"/>
       <w:spacing w:lineRule="auto" w:line="240" w:before="0" w:after="0"/>
       <w:ind w:hanging="0" w:start="0" w:end="0"/>
@@ -4814,11 +4809,38 @@
       <w:rFonts w:cs="Noto Sans Devanagari"/>
     </w:rPr>
   </w:style>
+  <w:style w:type="paragraph" w:styleId="Ttulouser">
+    <w:name w:val="Título (user)"/>
+    <w:basedOn w:val="Normal"/>
+    <w:next w:val="BodyText"/>
+    <w:qFormat/>
+    <w:pPr>
+      <w:keepNext w:val="true"/>
+      <w:spacing w:before="240" w:after="120"/>
+    </w:pPr>
+    <w:rPr>
+      <w:rFonts w:ascii="Liberation Sans" w:hAnsi="Liberation Sans" w:eastAsia="Noto Sans CJK SC" w:cs="Noto Sans Devanagari"/>
+      <w:sz w:val="28"/>
+      <w:szCs w:val="28"/>
+    </w:rPr>
+  </w:style>
+  <w:style w:type="paragraph" w:styleId="ndiceuser">
+    <w:name w:val="Índice (user)"/>
+    <w:basedOn w:val="Normal"/>
+    <w:qFormat/>
+    <w:pPr>
+      <w:suppressLineNumbers/>
+    </w:pPr>
+    <w:rPr>
+      <w:rFonts w:cs="Noto Sans Devanagari"/>
+    </w:rPr>
+  </w:style>
   <w:style w:type="paragraph" w:styleId="normal1" w:default="1">
     <w:name w:val="normal1"/>
     <w:qFormat/>
     <w:pPr>
       <w:widowControl/>
+      <w:suppressAutoHyphens w:val="true"/>
       <w:bidi w:val="0"/>
       <w:spacing w:before="0" w:after="0"/>
       <w:jc w:val="start"/>
@@ -4842,7 +4864,6 @@
       <w:keepLines w:val="false"/>
       <w:pageBreakBefore w:val="false"/>
       <w:widowControl/>
-      <w:pBdr/>
       <w:shd w:val="clear" w:fill="auto"/>
       <w:spacing w:lineRule="auto" w:line="240" w:before="0" w:after="0"/>
       <w:ind w:hanging="0" w:start="0" w:end="0"/>
@@ -4887,6 +4908,13 @@
       <w:szCs w:val="48"/>
     </w:rPr>
   </w:style>
+  <w:style w:type="paragraph" w:styleId="Cabeceraypieuser">
+    <w:name w:val="Cabecera y pie (user)"/>
+    <w:basedOn w:val="Normal"/>
+    <w:qFormat/>
+    <w:pPr/>
+    <w:rPr/>
+  </w:style>
   <w:style w:type="paragraph" w:styleId="Cabeceraypie">
     <w:name w:val="Cabecera y pie"/>
     <w:basedOn w:val="Normal"/>
@@ -4896,18 +4924,18 @@
   </w:style>
   <w:style w:type="paragraph" w:styleId="Header">
     <w:name w:val="header"/>
-    <w:basedOn w:val="Cabeceraypie"/>
+    <w:basedOn w:val="Cabeceraypieuser"/>
     <w:pPr/>
     <w:rPr/>
   </w:style>
   <w:style w:type="paragraph" w:styleId="Footer">
     <w:name w:val="footer"/>
-    <w:basedOn w:val="Cabeceraypie"/>
+    <w:basedOn w:val="Cabeceraypieuser"/>
     <w:pPr/>
     <w:rPr/>
   </w:style>
-  <w:style w:type="paragraph" w:styleId="Contenidodelatabla">
-    <w:name w:val="Contenido de la tabla"/>
+  <w:style w:type="paragraph" w:styleId="Contenidodelatablauser">
+    <w:name w:val="Contenido de la tabla (user)"/>
     <w:basedOn w:val="Normal"/>
     <w:qFormat/>
     <w:pPr>
@@ -4916,9 +4944,9 @@
     </w:pPr>
     <w:rPr/>
   </w:style>
-  <w:style w:type="paragraph" w:styleId="Ttulodelatabla">
-    <w:name w:val="Título de la tabla"/>
-    <w:basedOn w:val="Contenidodelatabla"/>
+  <w:style w:type="paragraph" w:styleId="Ttulodelatablauser">
+    <w:name w:val="Título de la tabla (user)"/>
+    <w:basedOn w:val="Contenidodelatablauser"/>
     <w:qFormat/>
     <w:pPr>
       <w:suppressLineNumbers/>

</xml_diff>